<commit_message>
Dercy Parte 4: revisão
Co-Authored-By: Claude Opus 5.5 <noreply@anthropic.com>
Claude-Session: https://claude.ai/code/session_01MJjUEEZrxQDEUifKK2vj9g
</commit_message>
<xml_diff>
--- a/roteiros/dercy/Dercy_Parte4.docx
+++ b/roteiros/dercy/Dercy_Parte4.docx
@@ -63,7 +63,7 @@
         <w:rPr>
           <w:color w:val="000000"/>
         </w:rPr>
-        <w:t>O Brasil acordou com a notícia.</w:t>
+        <w:t>O Brasil inteiro parou com a notícia.</w:t>
       </w:r>
     </w:p>
     <w:p>
@@ -151,7 +151,7 @@
         <w:rPr>
           <w:color w:val="000000"/>
         </w:rPr>
-        <w:t>A pedido dela, tocaram o samba que a Viradouro tinha feito em homenagem a ela em mil novecentos e noventa e um, o ano do desfile e o ano da pirâmide.</w:t>
+        <w:t>Durante as despedidas, a pedido dela, tocaram o samba que a Viradouro tinha feito em homenagem a ela em mil novecentos e noventa e um, o ano do desfile e o ano da pirâmide.</w:t>
       </w:r>
     </w:p>
     <w:p>
@@ -199,7 +199,7 @@
         <w:rPr>
           <w:color w:val="C00000"/>
         </w:rPr>
-        <w:t>Só que aquela pedra não ficou fechada nem um dia inteiro. Porque, na manhã seguinte, alguém voltou àquele túmulo. E o que fizeram ali dentro, longe dos fãs e das câmeras, levou anos para ser contado.</w:t>
+        <w:t>Só que aquela pedra não ficou fechada nem um dia inteiro. Porque, no dia seguinte, alguém voltou àquele túmulo. E o que fizeram ali dentro, longe dos fãs e das câmeras, levou anos para ser contado.</w:t>
       </w:r>
     </w:p>
     <w:p>
@@ -287,7 +287,7 @@
         <w:rPr>
           <w:color w:val="C00000"/>
         </w:rPr>
-        <w:t>Pense em quanto tempo aquele segredo ficou guardado. Uma das mulheres mais famosas do país, enterrada debaixo de uma pirâmide de vidro, à vista de todos. E ninguém de fora sabia o que realmente estava lá dentro. Até que alguém decidiu abrir aquela pedra na frente de milhões de pessoas.</w:t>
+        <w:t>Pense em quanto tempo aquele segredo ficou guardado. Uma das mulheres mais famosas do país, enterrada debaixo de uma pirâmide de vidro, à vista de todos. E, para a maioria das pessoas, o que estava lá dentro continuava um mistério. Até que alguém decidiu abrir aquela pedra na frente de milhões de pessoas.</w:t>
       </w:r>
     </w:p>
     <w:p>
@@ -535,7 +535,7 @@
         <w:rPr>
           <w:color w:val="C00000"/>
         </w:rPr>
-        <w:t>E o pior ainda estava por vir. Porque a versão da amiga não era a única. A própria filha de Dercy já tinha contado outra história sobre aquele caixão. Uma história que envolve a cidade inteira, uma ameaça e mais de doze homens dentro de um cemitério.</w:t>
+        <w:t>E o pior ainda estava por vir. Porque a versão da amiga não era a única. A própria filha de Dercy já tinha contado outra história sobre aquele caixão. Uma história que envolve moradores da cidade, uma ameaça e mais de doze homens dentro de um cemitério.</w:t>
       </w:r>
     </w:p>
     <w:sectPr>

</xml_diff>